<commit_message>
feat(textures): replace bubble wrap texture with realistic porous sponge across 3D model, manual, seeds, and guides
</commit_message>
<xml_diff>
--- a/BOMB_DEFUSAL_MANUAL.docx
+++ b/BOMB_DEFUSAL_MANUAL.docx
@@ -416,7 +416,7 @@
                 <w:rFonts w:ascii="Segoe UI" w:hAnsi="Segoe UI"/>
                 <w:sz w:val="19"/>
               </w:rPr>
-              <w:t>5 horizontal wires (Red, Blue, Yellow, Green, White, Black). Beside each wire is a hidden Tactile Texture Badge that ONLY BLIND can feel (Sandpaper, Bubble Wrap, Metal Coin, Soft Felt, Ribbed Cardboard).</w:t>
+              <w:t>5 horizontal wires (Red, Blue, Yellow, Green, White, Black). Beside each wire is a hidden Tactile Texture Badge that ONLY BLIND can feel (Sandpaper, Sponge, Metal Coin, Soft Felt, Ribbed Cardboard).</w:t>
             </w:r>
           </w:p>
         </w:tc>
@@ -718,7 +718,7 @@
                 <w:rFonts w:ascii="Segoe UI" w:hAnsi="Segoe UI"/>
                 <w:sz w:val="19"/>
               </w:rPr>
-              <w:t>• Beside each wire is a Tactile Texture Badge: Sandpaper, Bubble Wrap, Metal Coin, Soft Felt, or Ribbed Cardboard.</w:t>
+              <w:t>• Beside each wire is a Tactile Texture Badge: Sandpaper, Sponge, Metal Coin, Soft Felt, or Ribbed Cardboard.</w:t>
             </w:r>
           </w:p>
           <w:p>
@@ -972,7 +972,7 @@
               </w:rPr>
               <w:t>Disconnect the wire beside the</w:t>
               <w:br/>
-              <w:t>BUBBLE WRAP badge.</w:t>
+              <w:t>SPONGE badge.</w:t>
             </w:r>
           </w:p>
         </w:tc>
@@ -1425,7 +1425,7 @@
                 <w:rFonts w:ascii="Segoe UI" w:hAnsi="Segoe UI"/>
                 <w:sz w:val="19"/>
               </w:rPr>
-              <w:t>2. BUBBLE WRAP — Poppable plastic air bubbles</w:t>
+              <w:t>2. SPONGE — Soft, porous foam or kitchen sponge</w:t>
             </w:r>
           </w:p>
         </w:tc>
@@ -4576,7 +4576,7 @@
                 <w:rFonts w:ascii="Segoe UI" w:hAnsi="Segoe UI"/>
                 <w:sz w:val="19"/>
               </w:rPr>
-              <w:t>WIRE: Slot 2 (Bubble Wrap)</w:t>
+              <w:t>WIRE: Slot 2 (Sponge)</w:t>
               <w:br/>
               <w:t>DIALS: ▲RIGHT ■RIGHT ●UP</w:t>
               <w:br/>

</xml_diff>

<commit_message>
feat(wires): replace white wire with pink wire across 3D model, rules, seed presets, and manuals
</commit_message>
<xml_diff>
--- a/BOMB_DEFUSAL_MANUAL.docx
+++ b/BOMB_DEFUSAL_MANUAL.docx
@@ -410,13 +410,8 @@
             </w:tcMar>
           </w:tcPr>
           <w:p>
-            <w:r/>
             <w:r>
-              <w:rPr>
-                <w:rFonts w:ascii="Segoe UI" w:hAnsi="Segoe UI"/>
-                <w:sz w:val="19"/>
-              </w:rPr>
-              <w:t>5 horizontal wires (Red, Blue, Yellow, Green, White, Black). Beside each wire is a hidden Tactile Texture Badge that ONLY BLIND can feel (Sandpaper, Sponge, Metal Coin, Soft Felt, Ribbed Cardboard).</w:t>
+              <w:t>5 horizontal wires (Red, Blue, Yellow, Green, Pink, Black). Beside each wire is a hidden Tactile Texture Badge that ONLY BLIND can feel (Sandpaper, Sponge, Metal Coin, Soft Felt, Ribbed Cardboard).</w:t>
             </w:r>
           </w:p>
         </w:tc>
@@ -1155,13 +1150,8 @@
             </w:tcMar>
           </w:tcPr>
           <w:p>
-            <w:r/>
             <w:r>
-              <w:rPr>
-                <w:rFonts w:ascii="Segoe UI" w:hAnsi="Segoe UI"/>
-                <w:sz w:val="19"/>
-              </w:rPr>
-              <w:t>There is exactly 1 White wire AND the Mystery Chamber contains an AA BATTERY:</w:t>
+              <w:t>There is exactly 1 Pink wire AND the Mystery Chamber contains an AA BATTERY:</w:t>
             </w:r>
           </w:p>
         </w:tc>

</xml_diff>